<commit_message>
Améliorer la lisibilité des fiches de préparation
Co-authored-by: arena-agent <297053741+arena-agent@users.noreply.github.com>
</commit_message>
<xml_diff>
--- a/Echantillon_Complet_Fiche_Lecon_Exercices_V3.docx
+++ b/Echantillon_Complet_Fiche_Lecon_Exercices_V3.docx
@@ -43,7 +43,7 @@
       </w:pPr>
       <w:r>
         <w:rPr>
-          <w:rFonts w:ascii="Times New Roman" w:hAnsi="Times New Roman"/>
+          <w:rFonts w:ascii="Times New Roman" w:hAnsi="Times New Roman" w:eastAsia="Times New Roman"/>
           <w:b/>
           <w:i w:val="0"/>
           <w:color w:val="000000"/>
@@ -73,10 +73,15 @@
         <w:tc>
           <w:tcPr>
             <w:tcW w:type="dxa" w:w="5156"/>
-            <w:shd w:fill="D9EAF7"/>
+            <w:vAlign w:val="center"/>
           </w:tcPr>
           <w:p>
             <w:r>
+              <w:rPr>
+                <w:rFonts w:ascii="Times New Roman" w:hAnsi="Times New Roman" w:eastAsia="Times New Roman"/>
+                <w:color w:val="000000"/>
+                <w:sz w:val="22"/>
+              </w:rPr>
               <w:t>Matière</w:t>
             </w:r>
           </w:p>
@@ -84,15 +89,16 @@
         <w:tc>
           <w:tcPr>
             <w:tcW w:type="dxa" w:w="5156"/>
+            <w:vAlign w:val="center"/>
           </w:tcPr>
           <w:p>
             <w:r>
               <w:rPr>
-                <w:rFonts w:ascii="Times New Roman" w:hAnsi="Times New Roman"/>
+                <w:rFonts w:ascii="Times New Roman" w:hAnsi="Times New Roman" w:eastAsia="Times New Roman"/>
                 <w:b w:val="0"/>
                 <w:i w:val="0"/>
                 <w:color w:val="000000"/>
-                <w:sz w:val="18"/>
+                <w:sz w:val="22"/>
               </w:rPr>
               <w:t>Français</w:t>
             </w:r>
@@ -103,16 +109,16 @@
         <w:tc>
           <w:tcPr>
             <w:tcW w:type="dxa" w:w="5156"/>
-            <w:shd w:fill="D9EAF7"/>
+            <w:vAlign w:val="center"/>
           </w:tcPr>
           <w:p>
             <w:r>
               <w:rPr>
-                <w:rFonts w:ascii="Times New Roman" w:hAnsi="Times New Roman"/>
+                <w:rFonts w:ascii="Times New Roman" w:hAnsi="Times New Roman" w:eastAsia="Times New Roman"/>
                 <w:b/>
                 <w:i w:val="0"/>
                 <w:color w:val="000000"/>
-                <w:sz w:val="18"/>
+                <w:sz w:val="22"/>
               </w:rPr>
               <w:t>Classe</w:t>
             </w:r>
@@ -121,15 +127,16 @@
         <w:tc>
           <w:tcPr>
             <w:tcW w:type="dxa" w:w="5156"/>
+            <w:vAlign w:val="center"/>
           </w:tcPr>
           <w:p>
             <w:r>
               <w:rPr>
-                <w:rFonts w:ascii="Times New Roman" w:hAnsi="Times New Roman"/>
+                <w:rFonts w:ascii="Times New Roman" w:hAnsi="Times New Roman" w:eastAsia="Times New Roman"/>
                 <w:b w:val="0"/>
                 <w:i w:val="0"/>
                 <w:color w:val="000000"/>
-                <w:sz w:val="18"/>
+                <w:sz w:val="22"/>
               </w:rPr>
               <w:t>T6</w:t>
             </w:r>
@@ -140,16 +147,16 @@
         <w:tc>
           <w:tcPr>
             <w:tcW w:type="dxa" w:w="5156"/>
-            <w:shd w:fill="D9EAF7"/>
+            <w:vAlign w:val="center"/>
           </w:tcPr>
           <w:p>
             <w:r>
               <w:rPr>
-                <w:rFonts w:ascii="Times New Roman" w:hAnsi="Times New Roman"/>
+                <w:rFonts w:ascii="Times New Roman" w:hAnsi="Times New Roman" w:eastAsia="Times New Roman"/>
                 <w:b/>
                 <w:i w:val="0"/>
                 <w:color w:val="000000"/>
-                <w:sz w:val="18"/>
+                <w:sz w:val="22"/>
               </w:rPr>
               <w:t>Unité / thématique</w:t>
             </w:r>
@@ -158,15 +165,16 @@
         <w:tc>
           <w:tcPr>
             <w:tcW w:type="dxa" w:w="5156"/>
+            <w:vAlign w:val="center"/>
           </w:tcPr>
           <w:p>
             <w:r>
               <w:rPr>
-                <w:rFonts w:ascii="Times New Roman" w:hAnsi="Times New Roman"/>
+                <w:rFonts w:ascii="Times New Roman" w:hAnsi="Times New Roman" w:eastAsia="Times New Roman"/>
                 <w:b w:val="0"/>
                 <w:i w:val="0"/>
                 <w:color w:val="000000"/>
-                <w:sz w:val="18"/>
+                <w:sz w:val="22"/>
               </w:rPr>
               <w:t>Le voyage</w:t>
             </w:r>
@@ -177,16 +185,16 @@
         <w:tc>
           <w:tcPr>
             <w:tcW w:type="dxa" w:w="5156"/>
-            <w:shd w:fill="D9EAF7"/>
+            <w:vAlign w:val="center"/>
           </w:tcPr>
           <w:p>
             <w:r>
               <w:rPr>
-                <w:rFonts w:ascii="Times New Roman" w:hAnsi="Times New Roman"/>
+                <w:rFonts w:ascii="Times New Roman" w:hAnsi="Times New Roman" w:eastAsia="Times New Roman"/>
                 <w:b/>
                 <w:i w:val="0"/>
                 <w:color w:val="000000"/>
-                <w:sz w:val="18"/>
+                <w:sz w:val="22"/>
               </w:rPr>
               <w:t>Titre</w:t>
             </w:r>
@@ -195,15 +203,16 @@
         <w:tc>
           <w:tcPr>
             <w:tcW w:type="dxa" w:w="5156"/>
+            <w:vAlign w:val="center"/>
           </w:tcPr>
           <w:p>
             <w:r>
               <w:rPr>
-                <w:rFonts w:ascii="Times New Roman" w:hAnsi="Times New Roman"/>
+                <w:rFonts w:ascii="Times New Roman" w:hAnsi="Times New Roman" w:eastAsia="Times New Roman"/>
                 <w:b w:val="0"/>
                 <w:i w:val="0"/>
                 <w:color w:val="000000"/>
-                <w:sz w:val="18"/>
+                <w:sz w:val="22"/>
               </w:rPr>
               <w:t>Le texte descriptif</w:t>
             </w:r>
@@ -214,16 +223,16 @@
         <w:tc>
           <w:tcPr>
             <w:tcW w:type="dxa" w:w="5156"/>
-            <w:shd w:fill="D9EAF7"/>
+            <w:vAlign w:val="center"/>
           </w:tcPr>
           <w:p>
             <w:r>
               <w:rPr>
-                <w:rFonts w:ascii="Times New Roman" w:hAnsi="Times New Roman"/>
+                <w:rFonts w:ascii="Times New Roman" w:hAnsi="Times New Roman" w:eastAsia="Times New Roman"/>
                 <w:b/>
                 <w:i w:val="0"/>
                 <w:color w:val="000000"/>
-                <w:sz w:val="18"/>
+                <w:sz w:val="22"/>
               </w:rPr>
               <w:t>Composante principale</w:t>
             </w:r>
@@ -232,15 +241,16 @@
         <w:tc>
           <w:tcPr>
             <w:tcW w:type="dxa" w:w="5156"/>
+            <w:vAlign w:val="center"/>
           </w:tcPr>
           <w:p>
             <w:r>
               <w:rPr>
-                <w:rFonts w:ascii="Times New Roman" w:hAnsi="Times New Roman"/>
+                <w:rFonts w:ascii="Times New Roman" w:hAnsi="Times New Roman" w:eastAsia="Times New Roman"/>
                 <w:b w:val="0"/>
                 <w:i w:val="0"/>
                 <w:color w:val="000000"/>
-                <w:sz w:val="18"/>
+                <w:sz w:val="22"/>
               </w:rPr>
               <w:t>Compréhension écrite</w:t>
             </w:r>
@@ -251,16 +261,16 @@
         <w:tc>
           <w:tcPr>
             <w:tcW w:type="dxa" w:w="5156"/>
-            <w:shd w:fill="D9EAF7"/>
+            <w:vAlign w:val="center"/>
           </w:tcPr>
           <w:p>
             <w:r>
               <w:rPr>
-                <w:rFonts w:ascii="Times New Roman" w:hAnsi="Times New Roman"/>
+                <w:rFonts w:ascii="Times New Roman" w:hAnsi="Times New Roman" w:eastAsia="Times New Roman"/>
                 <w:b/>
                 <w:i w:val="0"/>
                 <w:color w:val="000000"/>
-                <w:sz w:val="18"/>
+                <w:sz w:val="22"/>
               </w:rPr>
               <w:t>Composantes associées</w:t>
             </w:r>
@@ -269,15 +279,16 @@
         <w:tc>
           <w:tcPr>
             <w:tcW w:type="dxa" w:w="5156"/>
+            <w:vAlign w:val="center"/>
           </w:tcPr>
           <w:p>
             <w:r>
               <w:rPr>
-                <w:rFonts w:ascii="Times New Roman" w:hAnsi="Times New Roman"/>
+                <w:rFonts w:ascii="Times New Roman" w:hAnsi="Times New Roman" w:eastAsia="Times New Roman"/>
                 <w:b w:val="0"/>
                 <w:i w:val="0"/>
                 <w:color w:val="000000"/>
-                <w:sz w:val="18"/>
+                <w:sz w:val="22"/>
               </w:rPr>
               <w:t>Fonctionnement de la langue, production orale, production écrite, lecture-fluidité</w:t>
             </w:r>
@@ -288,16 +299,16 @@
         <w:tc>
           <w:tcPr>
             <w:tcW w:type="dxa" w:w="5156"/>
-            <w:shd w:fill="D9EAF7"/>
+            <w:vAlign w:val="center"/>
           </w:tcPr>
           <w:p>
             <w:r>
               <w:rPr>
-                <w:rFonts w:ascii="Times New Roman" w:hAnsi="Times New Roman"/>
+                <w:rFonts w:ascii="Times New Roman" w:hAnsi="Times New Roman" w:eastAsia="Times New Roman"/>
                 <w:b/>
                 <w:i w:val="0"/>
                 <w:color w:val="000000"/>
-                <w:sz w:val="18"/>
+                <w:sz w:val="22"/>
               </w:rPr>
               <w:t>Résultat d’apprentissage spécifique</w:t>
             </w:r>
@@ -306,15 +317,16 @@
         <w:tc>
           <w:tcPr>
             <w:tcW w:type="dxa" w:w="5156"/>
+            <w:vAlign w:val="center"/>
           </w:tcPr>
           <w:p>
             <w:r>
               <w:rPr>
-                <w:rFonts w:ascii="Times New Roman" w:hAnsi="Times New Roman"/>
+                <w:rFonts w:ascii="Times New Roman" w:hAnsi="Times New Roman" w:eastAsia="Times New Roman"/>
                 <w:b w:val="0"/>
                 <w:i w:val="0"/>
                 <w:color w:val="000000"/>
-                <w:sz w:val="18"/>
+                <w:sz w:val="22"/>
               </w:rPr>
               <w:t>L’apprenant identifie les caractéristiques d’un texte descriptif et les utilise pour décrire un paysage.</w:t>
             </w:r>
@@ -325,16 +337,16 @@
         <w:tc>
           <w:tcPr>
             <w:tcW w:type="dxa" w:w="5156"/>
-            <w:shd w:fill="D9EAF7"/>
+            <w:vAlign w:val="center"/>
           </w:tcPr>
           <w:p>
             <w:r>
               <w:rPr>
-                <w:rFonts w:ascii="Times New Roman" w:hAnsi="Times New Roman"/>
+                <w:rFonts w:ascii="Times New Roman" w:hAnsi="Times New Roman" w:eastAsia="Times New Roman"/>
                 <w:b/>
                 <w:i w:val="0"/>
                 <w:color w:val="000000"/>
-                <w:sz w:val="18"/>
+                <w:sz w:val="22"/>
               </w:rPr>
               <w:t>Contenus</w:t>
             </w:r>
@@ -343,15 +355,16 @@
         <w:tc>
           <w:tcPr>
             <w:tcW w:type="dxa" w:w="5156"/>
+            <w:vAlign w:val="center"/>
           </w:tcPr>
           <w:p>
             <w:r>
               <w:rPr>
-                <w:rFonts w:ascii="Times New Roman" w:hAnsi="Times New Roman"/>
+                <w:rFonts w:ascii="Times New Roman" w:hAnsi="Times New Roman" w:eastAsia="Times New Roman"/>
                 <w:b w:val="0"/>
                 <w:i w:val="0"/>
                 <w:color w:val="000000"/>
-                <w:sz w:val="18"/>
+                <w:sz w:val="22"/>
               </w:rPr>
               <w:t>Texte descriptif, adjectifs qualificatifs, marqueurs de lieu, vocabulaire du paysage.</w:t>
             </w:r>
@@ -362,11 +375,11 @@
     <w:p>
       <w:r>
         <w:rPr>
-          <w:rFonts w:ascii="Times New Roman" w:hAnsi="Times New Roman"/>
+          <w:rFonts w:ascii="Times New Roman" w:hAnsi="Times New Roman" w:eastAsia="Times New Roman"/>
           <w:b w:val="0"/>
           <w:i/>
-          <w:color w:val="666666"/>
-          <w:sz w:val="20"/>
+          <w:color w:val="000000"/>
+          <w:sz w:val="22"/>
         </w:rPr>
         <w:t>Durée : ________</w:t>
       </w:r>
@@ -390,17 +403,19 @@
         <w:tc>
           <w:tcPr>
             <w:tcW w:type="dxa" w:w="1719"/>
-            <w:shd w:fill="1F4E79"/>
-            <w:vAlign w:val="top"/>
+            <w:vAlign w:val="center"/>
           </w:tcPr>
           <w:p>
+            <w:pPr>
+              <w:jc w:val="center"/>
+            </w:pPr>
             <w:r>
               <w:rPr>
-                <w:rFonts w:ascii="Times New Roman" w:hAnsi="Times New Roman"/>
+                <w:rFonts w:ascii="Times New Roman" w:hAnsi="Times New Roman" w:eastAsia="Times New Roman"/>
                 <w:b/>
                 <w:i w:val="0"/>
                 <w:color w:val="000000"/>
-                <w:sz w:val="16"/>
+                <w:sz w:val="21"/>
               </w:rPr>
               <w:t>Étapes et Durée</w:t>
             </w:r>
@@ -410,18 +425,19 @@
           <w:tcPr>
             <w:tcW w:type="dxa" w:w="3438"/>
             <w:gridSpan w:val="2"/>
-            <w:shd w:fill="1F4E79"/>
-            <w:shd w:fill="1F4E79"/>
-            <w:vAlign w:val="top"/>
+            <w:vAlign w:val="center"/>
           </w:tcPr>
           <w:p>
+            <w:pPr>
+              <w:jc w:val="center"/>
+            </w:pPr>
             <w:r>
               <w:rPr>
-                <w:rFonts w:ascii="Times New Roman" w:hAnsi="Times New Roman"/>
+                <w:rFonts w:ascii="Times New Roman" w:hAnsi="Times New Roman" w:eastAsia="Times New Roman"/>
                 <w:b/>
                 <w:i w:val="0"/>
                 <w:color w:val="000000"/>
-                <w:sz w:val="16"/>
+                <w:sz w:val="21"/>
               </w:rPr>
               <w:t>Déroulement de la leçon</w:t>
             </w:r>
@@ -430,17 +446,19 @@
         <w:tc>
           <w:tcPr>
             <w:tcW w:type="dxa" w:w="1719"/>
-            <w:shd w:fill="1F4E79"/>
-            <w:vAlign w:val="top"/>
+            <w:vAlign w:val="center"/>
           </w:tcPr>
           <w:p>
+            <w:pPr>
+              <w:jc w:val="center"/>
+            </w:pPr>
             <w:r>
               <w:rPr>
-                <w:rFonts w:ascii="Times New Roman" w:hAnsi="Times New Roman"/>
+                <w:rFonts w:ascii="Times New Roman" w:hAnsi="Times New Roman" w:eastAsia="Times New Roman"/>
                 <w:b/>
                 <w:i w:val="0"/>
                 <w:color w:val="000000"/>
-                <w:sz w:val="16"/>
+                <w:sz w:val="21"/>
               </w:rPr>
               <w:t>Technique et Stratégie</w:t>
             </w:r>
@@ -449,17 +467,19 @@
         <w:tc>
           <w:tcPr>
             <w:tcW w:type="dxa" w:w="1719"/>
-            <w:shd w:fill="1F4E79"/>
-            <w:vAlign w:val="top"/>
+            <w:vAlign w:val="center"/>
           </w:tcPr>
           <w:p>
+            <w:pPr>
+              <w:jc w:val="center"/>
+            </w:pPr>
             <w:r>
               <w:rPr>
-                <w:rFonts w:ascii="Times New Roman" w:hAnsi="Times New Roman"/>
+                <w:rFonts w:ascii="Times New Roman" w:hAnsi="Times New Roman" w:eastAsia="Times New Roman"/>
                 <w:b/>
                 <w:i w:val="0"/>
                 <w:color w:val="000000"/>
-                <w:sz w:val="16"/>
+                <w:sz w:val="21"/>
               </w:rPr>
               <w:t>Support et Matériel</w:t>
             </w:r>
@@ -468,17 +488,19 @@
         <w:tc>
           <w:tcPr>
             <w:tcW w:type="dxa" w:w="1719"/>
-            <w:shd w:fill="1F4E79"/>
-            <w:vAlign w:val="top"/>
+            <w:vAlign w:val="center"/>
           </w:tcPr>
           <w:p>
+            <w:pPr>
+              <w:jc w:val="center"/>
+            </w:pPr>
             <w:r>
               <w:rPr>
-                <w:rFonts w:ascii="Times New Roman" w:hAnsi="Times New Roman"/>
+                <w:rFonts w:ascii="Times New Roman" w:hAnsi="Times New Roman" w:eastAsia="Times New Roman"/>
                 <w:b/>
                 <w:i w:val="0"/>
                 <w:color w:val="000000"/>
-                <w:sz w:val="16"/>
+                <w:sz w:val="21"/>
               </w:rPr>
               <w:t>Observation</w:t>
             </w:r>
@@ -489,17 +511,19 @@
         <w:tc>
           <w:tcPr>
             <w:tcW w:type="dxa" w:w="1719"/>
-            <w:shd w:fill="D9EAF7"/>
-            <w:vAlign w:val="top"/>
+            <w:vAlign w:val="center"/>
           </w:tcPr>
           <w:p>
+            <w:pPr>
+              <w:jc w:val="center"/>
+            </w:pPr>
             <w:r>
               <w:rPr>
-                <w:rFonts w:ascii="Times New Roman" w:hAnsi="Times New Roman"/>
+                <w:rFonts w:ascii="Times New Roman" w:hAnsi="Times New Roman" w:eastAsia="Times New Roman"/>
                 <w:b/>
                 <w:i w:val="0"/>
                 <w:color w:val="000000"/>
-                <w:sz w:val="16"/>
+                <w:sz w:val="21"/>
               </w:rPr>
             </w:r>
           </w:p>
@@ -507,17 +531,19 @@
         <w:tc>
           <w:tcPr>
             <w:tcW w:type="dxa" w:w="1719"/>
-            <w:shd w:fill="D9EAF7"/>
-            <w:vAlign w:val="top"/>
+            <w:vAlign w:val="center"/>
           </w:tcPr>
           <w:p>
+            <w:pPr>
+              <w:jc w:val="center"/>
+            </w:pPr>
             <w:r>
               <w:rPr>
-                <w:rFonts w:ascii="Times New Roman" w:hAnsi="Times New Roman"/>
+                <w:rFonts w:ascii="Times New Roman" w:hAnsi="Times New Roman" w:eastAsia="Times New Roman"/>
                 <w:b/>
                 <w:i w:val="0"/>
                 <w:color w:val="000000"/>
-                <w:sz w:val="16"/>
+                <w:sz w:val="21"/>
               </w:rPr>
               <w:t>Enseignant</w:t>
             </w:r>
@@ -526,17 +552,19 @@
         <w:tc>
           <w:tcPr>
             <w:tcW w:type="dxa" w:w="1719"/>
-            <w:shd w:fill="D9EAF7"/>
-            <w:vAlign w:val="top"/>
+            <w:vAlign w:val="center"/>
           </w:tcPr>
           <w:p>
+            <w:pPr>
+              <w:jc w:val="center"/>
+            </w:pPr>
             <w:r>
               <w:rPr>
-                <w:rFonts w:ascii="Times New Roman" w:hAnsi="Times New Roman"/>
+                <w:rFonts w:ascii="Times New Roman" w:hAnsi="Times New Roman" w:eastAsia="Times New Roman"/>
                 <w:b/>
                 <w:i w:val="0"/>
                 <w:color w:val="000000"/>
-                <w:sz w:val="16"/>
+                <w:sz w:val="21"/>
               </w:rPr>
               <w:t>Apprenants</w:t>
             </w:r>
@@ -545,17 +573,19 @@
         <w:tc>
           <w:tcPr>
             <w:tcW w:type="dxa" w:w="1719"/>
-            <w:shd w:fill="D9EAF7"/>
-            <w:vAlign w:val="top"/>
+            <w:vAlign w:val="center"/>
           </w:tcPr>
           <w:p>
+            <w:pPr>
+              <w:jc w:val="center"/>
+            </w:pPr>
             <w:r>
               <w:rPr>
-                <w:rFonts w:ascii="Times New Roman" w:hAnsi="Times New Roman"/>
+                <w:rFonts w:ascii="Times New Roman" w:hAnsi="Times New Roman" w:eastAsia="Times New Roman"/>
                 <w:b/>
                 <w:i w:val="0"/>
                 <w:color w:val="000000"/>
-                <w:sz w:val="16"/>
+                <w:sz w:val="21"/>
               </w:rPr>
             </w:r>
           </w:p>
@@ -563,17 +593,19 @@
         <w:tc>
           <w:tcPr>
             <w:tcW w:type="dxa" w:w="1719"/>
-            <w:shd w:fill="D9EAF7"/>
-            <w:vAlign w:val="top"/>
+            <w:vAlign w:val="center"/>
           </w:tcPr>
           <w:p>
+            <w:pPr>
+              <w:jc w:val="center"/>
+            </w:pPr>
             <w:r>
               <w:rPr>
-                <w:rFonts w:ascii="Times New Roman" w:hAnsi="Times New Roman"/>
+                <w:rFonts w:ascii="Times New Roman" w:hAnsi="Times New Roman" w:eastAsia="Times New Roman"/>
                 <w:b/>
                 <w:i w:val="0"/>
                 <w:color w:val="000000"/>
-                <w:sz w:val="16"/>
+                <w:sz w:val="21"/>
               </w:rPr>
             </w:r>
           </w:p>
@@ -581,17 +613,19 @@
         <w:tc>
           <w:tcPr>
             <w:tcW w:type="dxa" w:w="1719"/>
-            <w:shd w:fill="D9EAF7"/>
-            <w:vAlign w:val="top"/>
+            <w:vAlign w:val="center"/>
           </w:tcPr>
           <w:p>
+            <w:pPr>
+              <w:jc w:val="center"/>
+            </w:pPr>
             <w:r>
               <w:rPr>
-                <w:rFonts w:ascii="Times New Roman" w:hAnsi="Times New Roman"/>
+                <w:rFonts w:ascii="Times New Roman" w:hAnsi="Times New Roman" w:eastAsia="Times New Roman"/>
                 <w:b/>
                 <w:i w:val="0"/>
                 <w:color w:val="000000"/>
-                <w:sz w:val="16"/>
+                <w:sz w:val="21"/>
               </w:rPr>
             </w:r>
           </w:p>
@@ -601,15 +635,16 @@
         <w:tc>
           <w:tcPr>
             <w:tcW w:type="dxa" w:w="1719"/>
+            <w:vAlign w:val="center"/>
           </w:tcPr>
           <w:p>
             <w:r>
               <w:rPr>
-                <w:rFonts w:ascii="Times New Roman" w:hAnsi="Times New Roman"/>
+                <w:rFonts w:ascii="Times New Roman" w:hAnsi="Times New Roman" w:eastAsia="Times New Roman"/>
                 <w:b/>
                 <w:i w:val="0"/>
                 <w:color w:val="000000"/>
-                <w:sz w:val="14"/>
+                <w:sz w:val="20"/>
               </w:rPr>
               <w:t>I. Révision — 10 min</w:t>
             </w:r>
@@ -618,15 +653,16 @@
         <w:tc>
           <w:tcPr>
             <w:tcW w:type="dxa" w:w="1719"/>
+            <w:vAlign w:val="center"/>
           </w:tcPr>
           <w:p>
             <w:r>
               <w:rPr>
-                <w:rFonts w:ascii="Times New Roman" w:hAnsi="Times New Roman"/>
+                <w:rFonts w:ascii="Times New Roman" w:hAnsi="Times New Roman" w:eastAsia="Times New Roman"/>
                 <w:b w:val="0"/>
                 <w:i w:val="0"/>
                 <w:color w:val="000000"/>
-                <w:sz w:val="14"/>
+                <w:sz w:val="20"/>
               </w:rPr>
               <w:t>1. Qu’est-ce qu’un lieu ? R.A. : Un lieu est un espace où se trouve une personne ou une chose.</w:t>
               <w:br/>
@@ -637,15 +673,16 @@
         <w:tc>
           <w:tcPr>
             <w:tcW w:type="dxa" w:w="1719"/>
+            <w:vAlign w:val="center"/>
           </w:tcPr>
           <w:p>
             <w:r>
               <w:rPr>
-                <w:rFonts w:ascii="Times New Roman" w:hAnsi="Times New Roman"/>
+                <w:rFonts w:ascii="Times New Roman" w:hAnsi="Times New Roman" w:eastAsia="Times New Roman"/>
                 <w:b w:val="0"/>
                 <w:i w:val="0"/>
                 <w:color w:val="000000"/>
-                <w:sz w:val="14"/>
+                <w:sz w:val="20"/>
               </w:rPr>
               <w:t>Répondent oralement en phrases complètes.</w:t>
             </w:r>
@@ -654,15 +691,16 @@
         <w:tc>
           <w:tcPr>
             <w:tcW w:type="dxa" w:w="1719"/>
+            <w:vAlign w:val="center"/>
           </w:tcPr>
           <w:p>
             <w:r>
               <w:rPr>
-                <w:rFonts w:ascii="Times New Roman" w:hAnsi="Times New Roman"/>
+                <w:rFonts w:ascii="Times New Roman" w:hAnsi="Times New Roman" w:eastAsia="Times New Roman"/>
                 <w:b w:val="0"/>
                 <w:i w:val="0"/>
                 <w:color w:val="000000"/>
-                <w:sz w:val="14"/>
+                <w:sz w:val="20"/>
               </w:rPr>
               <w:t>Questions-réponses</w:t>
             </w:r>
@@ -671,15 +709,16 @@
         <w:tc>
           <w:tcPr>
             <w:tcW w:type="dxa" w:w="1719"/>
+            <w:vAlign w:val="center"/>
           </w:tcPr>
           <w:p>
             <w:r>
               <w:rPr>
-                <w:rFonts w:ascii="Times New Roman" w:hAnsi="Times New Roman"/>
+                <w:rFonts w:ascii="Times New Roman" w:hAnsi="Times New Roman" w:eastAsia="Times New Roman"/>
                 <w:b w:val="0"/>
                 <w:i w:val="0"/>
                 <w:color w:val="000000"/>
-                <w:sz w:val="14"/>
+                <w:sz w:val="20"/>
               </w:rPr>
               <w:t>Tableau, cahier</w:t>
             </w:r>
@@ -688,15 +727,16 @@
         <w:tc>
           <w:tcPr>
             <w:tcW w:type="dxa" w:w="1719"/>
+            <w:vAlign w:val="center"/>
           </w:tcPr>
           <w:p>
             <w:r>
               <w:rPr>
-                <w:rFonts w:ascii="Times New Roman" w:hAnsi="Times New Roman"/>
+                <w:rFonts w:ascii="Times New Roman" w:hAnsi="Times New Roman" w:eastAsia="Times New Roman"/>
                 <w:b w:val="0"/>
                 <w:i w:val="0"/>
                 <w:color w:val="000000"/>
-                <w:sz w:val="14"/>
+                <w:sz w:val="20"/>
               </w:rPr>
               <w:t>Les acquis sont rappelés.</w:t>
             </w:r>
@@ -707,15 +747,16 @@
         <w:tc>
           <w:tcPr>
             <w:tcW w:type="dxa" w:w="1719"/>
+            <w:vAlign w:val="center"/>
           </w:tcPr>
           <w:p>
             <w:r>
               <w:rPr>
-                <w:rFonts w:ascii="Times New Roman" w:hAnsi="Times New Roman"/>
+                <w:rFonts w:ascii="Times New Roman" w:hAnsi="Times New Roman" w:eastAsia="Times New Roman"/>
                 <w:b/>
                 <w:i w:val="0"/>
                 <w:color w:val="000000"/>
-                <w:sz w:val="14"/>
+                <w:sz w:val="20"/>
               </w:rPr>
               <w:t>II. NOUVELLE LEÇON — 65 min</w:t>
             </w:r>
@@ -724,15 +765,16 @@
         <w:tc>
           <w:tcPr>
             <w:tcW w:type="dxa" w:w="1719"/>
+            <w:vAlign w:val="center"/>
           </w:tcPr>
           <w:p>
             <w:r>
               <w:rPr>
-                <w:rFonts w:ascii="Times New Roman" w:hAnsi="Times New Roman"/>
+                <w:rFonts w:ascii="Times New Roman" w:hAnsi="Times New Roman" w:eastAsia="Times New Roman"/>
                 <w:b w:val="0"/>
                 <w:i w:val="0"/>
                 <w:color w:val="000000"/>
-                <w:sz w:val="14"/>
+                <w:sz w:val="20"/>
               </w:rPr>
             </w:r>
           </w:p>
@@ -740,15 +782,16 @@
         <w:tc>
           <w:tcPr>
             <w:tcW w:type="dxa" w:w="1719"/>
+            <w:vAlign w:val="center"/>
           </w:tcPr>
           <w:p>
             <w:r>
               <w:rPr>
-                <w:rFonts w:ascii="Times New Roman" w:hAnsi="Times New Roman"/>
+                <w:rFonts w:ascii="Times New Roman" w:hAnsi="Times New Roman" w:eastAsia="Times New Roman"/>
                 <w:b w:val="0"/>
                 <w:i w:val="0"/>
                 <w:color w:val="000000"/>
-                <w:sz w:val="14"/>
+                <w:sz w:val="20"/>
               </w:rPr>
             </w:r>
           </w:p>
@@ -756,15 +799,16 @@
         <w:tc>
           <w:tcPr>
             <w:tcW w:type="dxa" w:w="1719"/>
+            <w:vAlign w:val="center"/>
           </w:tcPr>
           <w:p>
             <w:r>
               <w:rPr>
-                <w:rFonts w:ascii="Times New Roman" w:hAnsi="Times New Roman"/>
+                <w:rFonts w:ascii="Times New Roman" w:hAnsi="Times New Roman" w:eastAsia="Times New Roman"/>
                 <w:b w:val="0"/>
                 <w:i w:val="0"/>
                 <w:color w:val="000000"/>
-                <w:sz w:val="14"/>
+                <w:sz w:val="20"/>
               </w:rPr>
             </w:r>
           </w:p>
@@ -772,15 +816,16 @@
         <w:tc>
           <w:tcPr>
             <w:tcW w:type="dxa" w:w="1719"/>
+            <w:vAlign w:val="center"/>
           </w:tcPr>
           <w:p>
             <w:r>
               <w:rPr>
-                <w:rFonts w:ascii="Times New Roman" w:hAnsi="Times New Roman"/>
+                <w:rFonts w:ascii="Times New Roman" w:hAnsi="Times New Roman" w:eastAsia="Times New Roman"/>
                 <w:b w:val="0"/>
                 <w:i w:val="0"/>
                 <w:color w:val="000000"/>
-                <w:sz w:val="14"/>
+                <w:sz w:val="20"/>
               </w:rPr>
             </w:r>
           </w:p>
@@ -788,15 +833,16 @@
         <w:tc>
           <w:tcPr>
             <w:tcW w:type="dxa" w:w="1719"/>
+            <w:vAlign w:val="center"/>
           </w:tcPr>
           <w:p>
             <w:r>
               <w:rPr>
-                <w:rFonts w:ascii="Times New Roman" w:hAnsi="Times New Roman"/>
+                <w:rFonts w:ascii="Times New Roman" w:hAnsi="Times New Roman" w:eastAsia="Times New Roman"/>
                 <w:b w:val="0"/>
                 <w:i w:val="0"/>
                 <w:color w:val="000000"/>
-                <w:sz w:val="14"/>
+                <w:sz w:val="20"/>
               </w:rPr>
             </w:r>
           </w:p>
@@ -806,15 +852,16 @@
         <w:tc>
           <w:tcPr>
             <w:tcW w:type="dxa" w:w="1719"/>
+            <w:vAlign w:val="center"/>
           </w:tcPr>
           <w:p>
             <w:r>
               <w:rPr>
-                <w:rFonts w:ascii="Times New Roman" w:hAnsi="Times New Roman"/>
+                <w:rFonts w:ascii="Times New Roman" w:hAnsi="Times New Roman" w:eastAsia="Times New Roman"/>
                 <w:b/>
                 <w:i w:val="0"/>
                 <w:color w:val="000000"/>
-                <w:sz w:val="14"/>
+                <w:sz w:val="20"/>
               </w:rPr>
               <w:t>1. Mise en situation</w:t>
             </w:r>
@@ -823,15 +870,16 @@
         <w:tc>
           <w:tcPr>
             <w:tcW w:type="dxa" w:w="1719"/>
+            <w:vAlign w:val="center"/>
           </w:tcPr>
           <w:p>
             <w:r>
               <w:rPr>
-                <w:rFonts w:ascii="Times New Roman" w:hAnsi="Times New Roman"/>
+                <w:rFonts w:ascii="Times New Roman" w:hAnsi="Times New Roman" w:eastAsia="Times New Roman"/>
                 <w:b w:val="0"/>
                 <w:i w:val="0"/>
                 <w:color w:val="000000"/>
-                <w:sz w:val="14"/>
+                <w:sz w:val="20"/>
               </w:rPr>
               <w:t>Question : « Comment permettre à une personne qui n’a jamais vu un paysage de se le représenter ? » R.A. : En indiquant les lieux, les éléments visibles, leurs caractéristiques et leur position.</w:t>
             </w:r>
@@ -840,15 +888,16 @@
         <w:tc>
           <w:tcPr>
             <w:tcW w:type="dxa" w:w="1719"/>
+            <w:vAlign w:val="center"/>
           </w:tcPr>
           <w:p>
             <w:r>
               <w:rPr>
-                <w:rFonts w:ascii="Times New Roman" w:hAnsi="Times New Roman"/>
+                <w:rFonts w:ascii="Times New Roman" w:hAnsi="Times New Roman" w:eastAsia="Times New Roman"/>
                 <w:b w:val="0"/>
                 <w:i w:val="0"/>
                 <w:color w:val="000000"/>
-                <w:sz w:val="14"/>
+                <w:sz w:val="20"/>
               </w:rPr>
               <w:t>Écoutent et répondent oralement.</w:t>
             </w:r>
@@ -857,15 +906,16 @@
         <w:tc>
           <w:tcPr>
             <w:tcW w:type="dxa" w:w="1719"/>
+            <w:vAlign w:val="center"/>
           </w:tcPr>
           <w:p>
             <w:r>
               <w:rPr>
-                <w:rFonts w:ascii="Times New Roman" w:hAnsi="Times New Roman"/>
+                <w:rFonts w:ascii="Times New Roman" w:hAnsi="Times New Roman" w:eastAsia="Times New Roman"/>
                 <w:b w:val="0"/>
                 <w:i w:val="0"/>
                 <w:color w:val="000000"/>
-                <w:sz w:val="14"/>
+                <w:sz w:val="20"/>
               </w:rPr>
               <w:t>Questionnement</w:t>
             </w:r>
@@ -874,15 +924,16 @@
         <w:tc>
           <w:tcPr>
             <w:tcW w:type="dxa" w:w="1719"/>
+            <w:vAlign w:val="center"/>
           </w:tcPr>
           <w:p>
             <w:r>
               <w:rPr>
-                <w:rFonts w:ascii="Times New Roman" w:hAnsi="Times New Roman"/>
+                <w:rFonts w:ascii="Times New Roman" w:hAnsi="Times New Roman" w:eastAsia="Times New Roman"/>
                 <w:b w:val="0"/>
                 <w:i w:val="0"/>
                 <w:color w:val="000000"/>
-                <w:sz w:val="14"/>
+                <w:sz w:val="20"/>
               </w:rPr>
               <w:t>Illustration</w:t>
             </w:r>
@@ -891,15 +942,16 @@
         <w:tc>
           <w:tcPr>
             <w:tcW w:type="dxa" w:w="1719"/>
+            <w:vAlign w:val="center"/>
           </w:tcPr>
           <w:p>
             <w:r>
               <w:rPr>
-                <w:rFonts w:ascii="Times New Roman" w:hAnsi="Times New Roman"/>
+                <w:rFonts w:ascii="Times New Roman" w:hAnsi="Times New Roman" w:eastAsia="Times New Roman"/>
                 <w:b w:val="0"/>
                 <w:i w:val="0"/>
                 <w:color w:val="000000"/>
-                <w:sz w:val="14"/>
+                <w:sz w:val="20"/>
               </w:rPr>
               <w:t>Les représentations initiales sont recueillies.</w:t>
             </w:r>
@@ -910,15 +962,16 @@
         <w:tc>
           <w:tcPr>
             <w:tcW w:type="dxa" w:w="1719"/>
+            <w:vAlign w:val="center"/>
           </w:tcPr>
           <w:p>
             <w:r>
               <w:rPr>
-                <w:rFonts w:ascii="Times New Roman" w:hAnsi="Times New Roman"/>
+                <w:rFonts w:ascii="Times New Roman" w:hAnsi="Times New Roman" w:eastAsia="Times New Roman"/>
                 <w:b/>
                 <w:i w:val="0"/>
                 <w:color w:val="000000"/>
-                <w:sz w:val="14"/>
+                <w:sz w:val="20"/>
               </w:rPr>
               <w:t>2. Présentation</w:t>
             </w:r>
@@ -927,15 +980,16 @@
         <w:tc>
           <w:tcPr>
             <w:tcW w:type="dxa" w:w="1719"/>
+            <w:vAlign w:val="center"/>
           </w:tcPr>
           <w:p>
             <w:r>
               <w:rPr>
-                <w:rFonts w:ascii="Times New Roman" w:hAnsi="Times New Roman"/>
+                <w:rFonts w:ascii="Times New Roman" w:hAnsi="Times New Roman" w:eastAsia="Times New Roman"/>
                 <w:b w:val="0"/>
                 <w:i w:val="0"/>
                 <w:color w:val="000000"/>
-                <w:sz w:val="14"/>
+                <w:sz w:val="20"/>
               </w:rPr>
               <w:t>Annonce : « Aujourd’hui, nous allons étudier le texte descriptif et apprendre à décrire un paysage. »</w:t>
             </w:r>
@@ -944,15 +998,16 @@
         <w:tc>
           <w:tcPr>
             <w:tcW w:type="dxa" w:w="1719"/>
+            <w:vAlign w:val="center"/>
           </w:tcPr>
           <w:p>
             <w:r>
               <w:rPr>
-                <w:rFonts w:ascii="Times New Roman" w:hAnsi="Times New Roman"/>
+                <w:rFonts w:ascii="Times New Roman" w:hAnsi="Times New Roman" w:eastAsia="Times New Roman"/>
                 <w:b w:val="0"/>
                 <w:i w:val="0"/>
                 <w:color w:val="000000"/>
-                <w:sz w:val="14"/>
+                <w:sz w:val="20"/>
               </w:rPr>
               <w:t>Écoutent.</w:t>
             </w:r>
@@ -961,15 +1016,16 @@
         <w:tc>
           <w:tcPr>
             <w:tcW w:type="dxa" w:w="1719"/>
+            <w:vAlign w:val="center"/>
           </w:tcPr>
           <w:p>
             <w:r>
               <w:rPr>
-                <w:rFonts w:ascii="Times New Roman" w:hAnsi="Times New Roman"/>
+                <w:rFonts w:ascii="Times New Roman" w:hAnsi="Times New Roman" w:eastAsia="Times New Roman"/>
                 <w:b w:val="0"/>
                 <w:i w:val="0"/>
                 <w:color w:val="000000"/>
-                <w:sz w:val="14"/>
+                <w:sz w:val="20"/>
               </w:rPr>
               <w:t>Présentation</w:t>
             </w:r>
@@ -978,15 +1034,16 @@
         <w:tc>
           <w:tcPr>
             <w:tcW w:type="dxa" w:w="1719"/>
+            <w:vAlign w:val="center"/>
           </w:tcPr>
           <w:p>
             <w:r>
               <w:rPr>
-                <w:rFonts w:ascii="Times New Roman" w:hAnsi="Times New Roman"/>
+                <w:rFonts w:ascii="Times New Roman" w:hAnsi="Times New Roman" w:eastAsia="Times New Roman"/>
                 <w:b w:val="0"/>
                 <w:i w:val="0"/>
                 <w:color w:val="000000"/>
-                <w:sz w:val="14"/>
+                <w:sz w:val="20"/>
               </w:rPr>
               <w:t>Tableau</w:t>
             </w:r>
@@ -995,15 +1052,16 @@
         <w:tc>
           <w:tcPr>
             <w:tcW w:type="dxa" w:w="1719"/>
+            <w:vAlign w:val="center"/>
           </w:tcPr>
           <w:p>
             <w:r>
               <w:rPr>
-                <w:rFonts w:ascii="Times New Roman" w:hAnsi="Times New Roman"/>
+                <w:rFonts w:ascii="Times New Roman" w:hAnsi="Times New Roman" w:eastAsia="Times New Roman"/>
                 <w:b w:val="0"/>
                 <w:i w:val="0"/>
                 <w:color w:val="000000"/>
-                <w:sz w:val="14"/>
+                <w:sz w:val="20"/>
               </w:rPr>
               <w:t>Le titre est compris.</w:t>
             </w:r>
@@ -1014,15 +1072,16 @@
         <w:tc>
           <w:tcPr>
             <w:tcW w:type="dxa" w:w="1719"/>
+            <w:vAlign w:val="center"/>
           </w:tcPr>
           <w:p>
             <w:r>
               <w:rPr>
-                <w:rFonts w:ascii="Times New Roman" w:hAnsi="Times New Roman"/>
+                <w:rFonts w:ascii="Times New Roman" w:hAnsi="Times New Roman" w:eastAsia="Times New Roman"/>
                 <w:b/>
                 <w:i w:val="0"/>
                 <w:color w:val="000000"/>
-                <w:sz w:val="14"/>
+                <w:sz w:val="20"/>
               </w:rPr>
               <w:t>3. Observation</w:t>
             </w:r>
@@ -1031,15 +1090,16 @@
         <w:tc>
           <w:tcPr>
             <w:tcW w:type="dxa" w:w="1719"/>
+            <w:vAlign w:val="center"/>
           </w:tcPr>
           <w:p>
             <w:r>
               <w:rPr>
-                <w:rFonts w:ascii="Times New Roman" w:hAnsi="Times New Roman"/>
+                <w:rFonts w:ascii="Times New Roman" w:hAnsi="Times New Roman" w:eastAsia="Times New Roman"/>
                 <w:b w:val="0"/>
                 <w:i w:val="0"/>
                 <w:color w:val="000000"/>
-                <w:sz w:val="14"/>
+                <w:sz w:val="20"/>
               </w:rPr>
               <w:t>« Observez silencieusement l’illustration. Repérez les lieux, les éléments naturels, les couleurs et les positions. »</w:t>
             </w:r>
@@ -1048,15 +1108,16 @@
         <w:tc>
           <w:tcPr>
             <w:tcW w:type="dxa" w:w="1719"/>
+            <w:vAlign w:val="center"/>
           </w:tcPr>
           <w:p>
             <w:r>
               <w:rPr>
-                <w:rFonts w:ascii="Times New Roman" w:hAnsi="Times New Roman"/>
+                <w:rFonts w:ascii="Times New Roman" w:hAnsi="Times New Roman" w:eastAsia="Times New Roman"/>
                 <w:b w:val="0"/>
                 <w:i w:val="0"/>
                 <w:color w:val="000000"/>
-                <w:sz w:val="14"/>
+                <w:sz w:val="20"/>
               </w:rPr>
               <w:t>Observent sans répondre à cette étape.</w:t>
             </w:r>
@@ -1065,15 +1126,16 @@
         <w:tc>
           <w:tcPr>
             <w:tcW w:type="dxa" w:w="1719"/>
+            <w:vAlign w:val="center"/>
           </w:tcPr>
           <w:p>
             <w:r>
               <w:rPr>
-                <w:rFonts w:ascii="Times New Roman" w:hAnsi="Times New Roman"/>
+                <w:rFonts w:ascii="Times New Roman" w:hAnsi="Times New Roman" w:eastAsia="Times New Roman"/>
                 <w:b w:val="0"/>
                 <w:i w:val="0"/>
                 <w:color w:val="000000"/>
-                <w:sz w:val="14"/>
+                <w:sz w:val="20"/>
               </w:rPr>
               <w:t>Observation guidée</w:t>
             </w:r>
@@ -1082,15 +1144,16 @@
         <w:tc>
           <w:tcPr>
             <w:tcW w:type="dxa" w:w="1719"/>
+            <w:vAlign w:val="center"/>
           </w:tcPr>
           <w:p>
             <w:r>
               <w:rPr>
-                <w:rFonts w:ascii="Times New Roman" w:hAnsi="Times New Roman"/>
+                <w:rFonts w:ascii="Times New Roman" w:hAnsi="Times New Roman" w:eastAsia="Times New Roman"/>
                 <w:b w:val="0"/>
                 <w:i w:val="0"/>
                 <w:color w:val="000000"/>
-                <w:sz w:val="14"/>
+                <w:sz w:val="20"/>
               </w:rPr>
               <w:t>Illustration originale</w:t>
             </w:r>
@@ -1099,15 +1162,16 @@
         <w:tc>
           <w:tcPr>
             <w:tcW w:type="dxa" w:w="1719"/>
+            <w:vAlign w:val="center"/>
           </w:tcPr>
           <w:p>
             <w:r>
               <w:rPr>
-                <w:rFonts w:ascii="Times New Roman" w:hAnsi="Times New Roman"/>
+                <w:rFonts w:ascii="Times New Roman" w:hAnsi="Times New Roman" w:eastAsia="Times New Roman"/>
                 <w:b w:val="0"/>
                 <w:i w:val="0"/>
                 <w:color w:val="000000"/>
-                <w:sz w:val="14"/>
+                <w:sz w:val="20"/>
               </w:rPr>
               <w:t>Les indices visuels sont repérés.</w:t>
             </w:r>
@@ -1118,15 +1182,16 @@
         <w:tc>
           <w:tcPr>
             <w:tcW w:type="dxa" w:w="1719"/>
+            <w:vAlign w:val="center"/>
           </w:tcPr>
           <w:p>
             <w:r>
               <w:rPr>
-                <w:rFonts w:ascii="Times New Roman" w:hAnsi="Times New Roman"/>
+                <w:rFonts w:ascii="Times New Roman" w:hAnsi="Times New Roman" w:eastAsia="Times New Roman"/>
                 <w:b/>
                 <w:i w:val="0"/>
                 <w:color w:val="000000"/>
-                <w:sz w:val="14"/>
+                <w:sz w:val="20"/>
               </w:rPr>
               <w:t>4. Analyse</w:t>
             </w:r>
@@ -1135,15 +1200,16 @@
         <w:tc>
           <w:tcPr>
             <w:tcW w:type="dxa" w:w="1719"/>
+            <w:vAlign w:val="center"/>
           </w:tcPr>
           <w:p>
             <w:r>
               <w:rPr>
-                <w:rFonts w:ascii="Times New Roman" w:hAnsi="Times New Roman"/>
+                <w:rFonts w:ascii="Times New Roman" w:hAnsi="Times New Roman" w:eastAsia="Times New Roman"/>
                 <w:b w:val="0"/>
                 <w:i w:val="0"/>
                 <w:color w:val="000000"/>
-                <w:sz w:val="14"/>
+                <w:sz w:val="20"/>
               </w:rPr>
               <w:t>Question : Quels lieux voyez-vous ? R.A. : Un village, une rivière, des rizières, une forêt et une plage.</w:t>
               <w:br/>
@@ -1158,15 +1224,16 @@
         <w:tc>
           <w:tcPr>
             <w:tcW w:type="dxa" w:w="1719"/>
+            <w:vAlign w:val="center"/>
           </w:tcPr>
           <w:p>
             <w:r>
               <w:rPr>
-                <w:rFonts w:ascii="Times New Roman" w:hAnsi="Times New Roman"/>
+                <w:rFonts w:ascii="Times New Roman" w:hAnsi="Times New Roman" w:eastAsia="Times New Roman"/>
                 <w:b w:val="0"/>
                 <w:i w:val="0"/>
                 <w:color w:val="000000"/>
-                <w:sz w:val="14"/>
+                <w:sz w:val="20"/>
               </w:rPr>
               <w:t>Répondent et justifient chaque réponse par un élément de l’illustration.</w:t>
             </w:r>
@@ -1175,15 +1242,16 @@
         <w:tc>
           <w:tcPr>
             <w:tcW w:type="dxa" w:w="1719"/>
+            <w:vAlign w:val="center"/>
           </w:tcPr>
           <w:p>
             <w:r>
               <w:rPr>
-                <w:rFonts w:ascii="Times New Roman" w:hAnsi="Times New Roman"/>
+                <w:rFonts w:ascii="Times New Roman" w:hAnsi="Times New Roman" w:eastAsia="Times New Roman"/>
                 <w:b w:val="0"/>
                 <w:i w:val="0"/>
                 <w:color w:val="000000"/>
-                <w:sz w:val="14"/>
+                <w:sz w:val="20"/>
               </w:rPr>
               <w:t>Observation, analyse, questions-réponses</w:t>
             </w:r>
@@ -1192,15 +1260,16 @@
         <w:tc>
           <w:tcPr>
             <w:tcW w:type="dxa" w:w="1719"/>
+            <w:vAlign w:val="center"/>
           </w:tcPr>
           <w:p>
             <w:r>
               <w:rPr>
-                <w:rFonts w:ascii="Times New Roman" w:hAnsi="Times New Roman"/>
+                <w:rFonts w:ascii="Times New Roman" w:hAnsi="Times New Roman" w:eastAsia="Times New Roman"/>
                 <w:b w:val="0"/>
                 <w:i w:val="0"/>
                 <w:color w:val="000000"/>
-                <w:sz w:val="14"/>
+                <w:sz w:val="20"/>
               </w:rPr>
               <w:t>Illustration, tableau</w:t>
             </w:r>
@@ -1209,15 +1278,16 @@
         <w:tc>
           <w:tcPr>
             <w:tcW w:type="dxa" w:w="1719"/>
+            <w:vAlign w:val="center"/>
           </w:tcPr>
           <w:p>
             <w:r>
               <w:rPr>
-                <w:rFonts w:ascii="Times New Roman" w:hAnsi="Times New Roman"/>
+                <w:rFonts w:ascii="Times New Roman" w:hAnsi="Times New Roman" w:eastAsia="Times New Roman"/>
                 <w:b w:val="0"/>
                 <w:i w:val="0"/>
                 <w:color w:val="000000"/>
-                <w:sz w:val="14"/>
+                <w:sz w:val="20"/>
               </w:rPr>
               <w:t>Chaque R.A. correspond à une question.</w:t>
             </w:r>
@@ -1228,15 +1298,16 @@
         <w:tc>
           <w:tcPr>
             <w:tcW w:type="dxa" w:w="1719"/>
+            <w:vAlign w:val="center"/>
           </w:tcPr>
           <w:p>
             <w:r>
               <w:rPr>
-                <w:rFonts w:ascii="Times New Roman" w:hAnsi="Times New Roman"/>
+                <w:rFonts w:ascii="Times New Roman" w:hAnsi="Times New Roman" w:eastAsia="Times New Roman"/>
                 <w:b/>
                 <w:i w:val="0"/>
                 <w:color w:val="000000"/>
-                <w:sz w:val="14"/>
+                <w:sz w:val="20"/>
               </w:rPr>
               <w:t>5. Synthèse</w:t>
             </w:r>
@@ -1245,15 +1316,16 @@
         <w:tc>
           <w:tcPr>
             <w:tcW w:type="dxa" w:w="1719"/>
+            <w:vAlign w:val="center"/>
           </w:tcPr>
           <w:p>
             <w:r>
               <w:rPr>
-                <w:rFonts w:ascii="Times New Roman" w:hAnsi="Times New Roman"/>
+                <w:rFonts w:ascii="Times New Roman" w:hAnsi="Times New Roman" w:eastAsia="Times New Roman"/>
                 <w:b w:val="0"/>
                 <w:i w:val="0"/>
                 <w:color w:val="000000"/>
-                <w:sz w:val="14"/>
+                <w:sz w:val="20"/>
               </w:rPr>
               <w:t>Donc, un texte descriptif présente un lieu ou un paysage en donnant des détails précis. Il utilise des adjectifs qualificatifs et des marqueurs de lieu. Les éléments sont organisés dans un ordre logique.</w:t>
             </w:r>
@@ -1262,15 +1334,16 @@
         <w:tc>
           <w:tcPr>
             <w:tcW w:type="dxa" w:w="1719"/>
+            <w:vAlign w:val="center"/>
           </w:tcPr>
           <w:p>
             <w:r>
               <w:rPr>
-                <w:rFonts w:ascii="Times New Roman" w:hAnsi="Times New Roman"/>
+                <w:rFonts w:ascii="Times New Roman" w:hAnsi="Times New Roman" w:eastAsia="Times New Roman"/>
                 <w:b w:val="0"/>
                 <w:i w:val="0"/>
                 <w:color w:val="000000"/>
-                <w:sz w:val="14"/>
+                <w:sz w:val="20"/>
               </w:rPr>
               <w:t>Écoutent et relisent la synthèse.</w:t>
             </w:r>
@@ -1279,15 +1352,16 @@
         <w:tc>
           <w:tcPr>
             <w:tcW w:type="dxa" w:w="1719"/>
+            <w:vAlign w:val="center"/>
           </w:tcPr>
           <w:p>
             <w:r>
               <w:rPr>
-                <w:rFonts w:ascii="Times New Roman" w:hAnsi="Times New Roman"/>
+                <w:rFonts w:ascii="Times New Roman" w:hAnsi="Times New Roman" w:eastAsia="Times New Roman"/>
                 <w:b w:val="0"/>
                 <w:i w:val="0"/>
                 <w:color w:val="000000"/>
-                <w:sz w:val="14"/>
+                <w:sz w:val="20"/>
               </w:rPr>
               <w:t>Reformulation</w:t>
             </w:r>
@@ -1296,15 +1370,16 @@
         <w:tc>
           <w:tcPr>
             <w:tcW w:type="dxa" w:w="1719"/>
+            <w:vAlign w:val="center"/>
           </w:tcPr>
           <w:p>
             <w:r>
               <w:rPr>
-                <w:rFonts w:ascii="Times New Roman" w:hAnsi="Times New Roman"/>
+                <w:rFonts w:ascii="Times New Roman" w:hAnsi="Times New Roman" w:eastAsia="Times New Roman"/>
                 <w:b w:val="0"/>
                 <w:i w:val="0"/>
                 <w:color w:val="000000"/>
-                <w:sz w:val="14"/>
+                <w:sz w:val="20"/>
               </w:rPr>
               <w:t>Tableau</w:t>
             </w:r>
@@ -1313,15 +1388,16 @@
         <w:tc>
           <w:tcPr>
             <w:tcW w:type="dxa" w:w="1719"/>
+            <w:vAlign w:val="center"/>
           </w:tcPr>
           <w:p>
             <w:r>
               <w:rPr>
-                <w:rFonts w:ascii="Times New Roman" w:hAnsi="Times New Roman"/>
+                <w:rFonts w:ascii="Times New Roman" w:hAnsi="Times New Roman" w:eastAsia="Times New Roman"/>
                 <w:b w:val="0"/>
                 <w:i w:val="0"/>
                 <w:color w:val="000000"/>
-                <w:sz w:val="14"/>
+                <w:sz w:val="20"/>
               </w:rPr>
               <w:t>La règle est formulée.</w:t>
             </w:r>
@@ -1332,15 +1408,16 @@
         <w:tc>
           <w:tcPr>
             <w:tcW w:type="dxa" w:w="1719"/>
+            <w:vAlign w:val="center"/>
           </w:tcPr>
           <w:p>
             <w:r>
               <w:rPr>
-                <w:rFonts w:ascii="Times New Roman" w:hAnsi="Times New Roman"/>
+                <w:rFonts w:ascii="Times New Roman" w:hAnsi="Times New Roman" w:eastAsia="Times New Roman"/>
                 <w:b/>
                 <w:i w:val="0"/>
                 <w:color w:val="000000"/>
-                <w:sz w:val="14"/>
+                <w:sz w:val="20"/>
               </w:rPr>
               <w:t>6. Application</w:t>
             </w:r>
@@ -1349,15 +1426,16 @@
         <w:tc>
           <w:tcPr>
             <w:tcW w:type="dxa" w:w="1719"/>
+            <w:vAlign w:val="center"/>
           </w:tcPr>
           <w:p>
             <w:r>
               <w:rPr>
-                <w:rFonts w:ascii="Times New Roman" w:hAnsi="Times New Roman"/>
+                <w:rFonts w:ascii="Times New Roman" w:hAnsi="Times New Roman" w:eastAsia="Times New Roman"/>
                 <w:b w:val="0"/>
                 <w:i w:val="0"/>
                 <w:color w:val="000000"/>
-                <w:sz w:val="14"/>
+                <w:sz w:val="20"/>
               </w:rPr>
               <w:t>1. Relève quatre adjectifs dans le texte.</w:t>
               <w:br/>
@@ -1370,15 +1448,16 @@
         <w:tc>
           <w:tcPr>
             <w:tcW w:type="dxa" w:w="1719"/>
+            <w:vAlign w:val="center"/>
           </w:tcPr>
           <w:p>
             <w:r>
               <w:rPr>
-                <w:rFonts w:ascii="Times New Roman" w:hAnsi="Times New Roman"/>
+                <w:rFonts w:ascii="Times New Roman" w:hAnsi="Times New Roman" w:eastAsia="Times New Roman"/>
                 <w:b w:val="0"/>
                 <w:i w:val="0"/>
                 <w:color w:val="000000"/>
-                <w:sz w:val="14"/>
+                <w:sz w:val="20"/>
               </w:rPr>
               <w:t>Réalisent les exercices, puis corrigent collectivement.</w:t>
             </w:r>
@@ -1387,15 +1466,16 @@
         <w:tc>
           <w:tcPr>
             <w:tcW w:type="dxa" w:w="1719"/>
+            <w:vAlign w:val="center"/>
           </w:tcPr>
           <w:p>
             <w:r>
               <w:rPr>
-                <w:rFonts w:ascii="Times New Roman" w:hAnsi="Times New Roman"/>
+                <w:rFonts w:ascii="Times New Roman" w:hAnsi="Times New Roman" w:eastAsia="Times New Roman"/>
                 <w:b w:val="0"/>
                 <w:i w:val="0"/>
                 <w:color w:val="000000"/>
-                <w:sz w:val="14"/>
+                <w:sz w:val="20"/>
               </w:rPr>
               <w:t>Travail individuel, correction collective</w:t>
             </w:r>
@@ -1404,15 +1484,16 @@
         <w:tc>
           <w:tcPr>
             <w:tcW w:type="dxa" w:w="1719"/>
+            <w:vAlign w:val="center"/>
           </w:tcPr>
           <w:p>
             <w:r>
               <w:rPr>
-                <w:rFonts w:ascii="Times New Roman" w:hAnsi="Times New Roman"/>
+                <w:rFonts w:ascii="Times New Roman" w:hAnsi="Times New Roman" w:eastAsia="Times New Roman"/>
                 <w:b w:val="0"/>
                 <w:i w:val="0"/>
                 <w:color w:val="000000"/>
-                <w:sz w:val="14"/>
+                <w:sz w:val="20"/>
               </w:rPr>
               <w:t>Texte, illustration, cahier</w:t>
             </w:r>
@@ -1421,15 +1502,16 @@
         <w:tc>
           <w:tcPr>
             <w:tcW w:type="dxa" w:w="1719"/>
+            <w:vAlign w:val="center"/>
           </w:tcPr>
           <w:p>
             <w:r>
               <w:rPr>
-                <w:rFonts w:ascii="Times New Roman" w:hAnsi="Times New Roman"/>
+                <w:rFonts w:ascii="Times New Roman" w:hAnsi="Times New Roman" w:eastAsia="Times New Roman"/>
                 <w:b w:val="0"/>
                 <w:i w:val="0"/>
                 <w:color w:val="000000"/>
-                <w:sz w:val="14"/>
+                <w:sz w:val="20"/>
               </w:rPr>
               <w:t>Exercices non notés.</w:t>
             </w:r>
@@ -1440,15 +1522,16 @@
         <w:tc>
           <w:tcPr>
             <w:tcW w:type="dxa" w:w="1719"/>
+            <w:vAlign w:val="center"/>
           </w:tcPr>
           <w:p>
             <w:r>
               <w:rPr>
-                <w:rFonts w:ascii="Times New Roman" w:hAnsi="Times New Roman"/>
+                <w:rFonts w:ascii="Times New Roman" w:hAnsi="Times New Roman" w:eastAsia="Times New Roman"/>
                 <w:b/>
                 <w:i w:val="0"/>
                 <w:color w:val="000000"/>
-                <w:sz w:val="14"/>
+                <w:sz w:val="20"/>
               </w:rPr>
               <w:t>III. Évaluation — 15 min</w:t>
             </w:r>
@@ -1457,15 +1540,16 @@
         <w:tc>
           <w:tcPr>
             <w:tcW w:type="dxa" w:w="1719"/>
+            <w:vAlign w:val="center"/>
           </w:tcPr>
           <w:p>
             <w:r>
               <w:rPr>
-                <w:rFonts w:ascii="Times New Roman" w:hAnsi="Times New Roman"/>
+                <w:rFonts w:ascii="Times New Roman" w:hAnsi="Times New Roman" w:eastAsia="Times New Roman"/>
                 <w:b w:val="0"/>
                 <w:i w:val="0"/>
                 <w:color w:val="000000"/>
-                <w:sz w:val="14"/>
+                <w:sz w:val="20"/>
               </w:rPr>
               <w:t>1. Donne la définition d’un texte descriptif.</w:t>
               <w:br/>
@@ -1478,15 +1562,16 @@
         <w:tc>
           <w:tcPr>
             <w:tcW w:type="dxa" w:w="1719"/>
+            <w:vAlign w:val="center"/>
           </w:tcPr>
           <w:p>
             <w:r>
               <w:rPr>
-                <w:rFonts w:ascii="Times New Roman" w:hAnsi="Times New Roman"/>
+                <w:rFonts w:ascii="Times New Roman" w:hAnsi="Times New Roman" w:eastAsia="Times New Roman"/>
                 <w:b w:val="0"/>
                 <w:i w:val="0"/>
                 <w:color w:val="000000"/>
-                <w:sz w:val="14"/>
+                <w:sz w:val="20"/>
               </w:rPr>
               <w:t>Répondent individuellement.</w:t>
             </w:r>
@@ -1495,15 +1580,16 @@
         <w:tc>
           <w:tcPr>
             <w:tcW w:type="dxa" w:w="1719"/>
+            <w:vAlign w:val="center"/>
           </w:tcPr>
           <w:p>
             <w:r>
               <w:rPr>
-                <w:rFonts w:ascii="Times New Roman" w:hAnsi="Times New Roman"/>
+                <w:rFonts w:ascii="Times New Roman" w:hAnsi="Times New Roman" w:eastAsia="Times New Roman"/>
                 <w:b w:val="0"/>
                 <w:i w:val="0"/>
                 <w:color w:val="000000"/>
-                <w:sz w:val="14"/>
+                <w:sz w:val="20"/>
               </w:rPr>
               <w:t>Évaluation écrite</w:t>
             </w:r>
@@ -1512,15 +1598,16 @@
         <w:tc>
           <w:tcPr>
             <w:tcW w:type="dxa" w:w="1719"/>
+            <w:vAlign w:val="center"/>
           </w:tcPr>
           <w:p>
             <w:r>
               <w:rPr>
-                <w:rFonts w:ascii="Times New Roman" w:hAnsi="Times New Roman"/>
+                <w:rFonts w:ascii="Times New Roman" w:hAnsi="Times New Roman" w:eastAsia="Times New Roman"/>
                 <w:b w:val="0"/>
                 <w:i w:val="0"/>
                 <w:color w:val="000000"/>
-                <w:sz w:val="14"/>
+                <w:sz w:val="20"/>
               </w:rPr>
               <w:t>Cahier, illustration</w:t>
             </w:r>
@@ -1529,15 +1616,16 @@
         <w:tc>
           <w:tcPr>
             <w:tcW w:type="dxa" w:w="1719"/>
+            <w:vAlign w:val="center"/>
           </w:tcPr>
           <w:p>
             <w:r>
               <w:rPr>
-                <w:rFonts w:ascii="Times New Roman" w:hAnsi="Times New Roman"/>
+                <w:rFonts w:ascii="Times New Roman" w:hAnsi="Times New Roman" w:eastAsia="Times New Roman"/>
                 <w:b w:val="0"/>
                 <w:i w:val="0"/>
                 <w:color w:val="000000"/>
-                <w:sz w:val="14"/>
+                <w:sz w:val="20"/>
               </w:rPr>
               <w:t>La compétence est vérifiée.</w:t>
             </w:r>

</xml_diff>